<commit_message>
commit completare tabel requirements
</commit_message>
<xml_diff>
--- a/docs/Lab01/Requirements_v2.0.docx
+++ b/docs/Lab01/Requirements_v2.0.docx
@@ -71,12 +71,27 @@
         <w:rPr>
           <w:rFonts w:cstheme="minorHAnsi"/>
         </w:rPr>
-        <w:t xml:space="preserve"> (datele trebuie sa fie </w:t>
+        <w:t xml:space="preserve"> </w:t>
+      </w:r>
+      <w:r>
+        <w:rPr>
+          <w:rFonts w:cstheme="minorHAnsi"/>
+          <w:u w:val="single"/>
+        </w:rPr>
+        <w:t>(</w:t>
+      </w:r>
+      <w:r>
+        <w:rPr>
+          <w:rFonts w:cstheme="minorHAnsi"/>
+          <w:u w:val="single"/>
+        </w:rPr>
+        <w:t xml:space="preserve">datele nu este obligatoriu sa fie </w:t>
       </w:r>
       <w:proofErr w:type="spellStart"/>
       <w:r>
         <w:rPr>
           <w:rFonts w:cstheme="minorHAnsi"/>
+          <w:u w:val="single"/>
         </w:rPr>
         <w:t>intelese</w:t>
       </w:r>
@@ -84,13 +99,15 @@
       <w:r>
         <w:rPr>
           <w:rFonts w:cstheme="minorHAnsi"/>
-        </w:rPr>
-        <w:t xml:space="preserve"> si de </w:t>
+          <w:u w:val="single"/>
+        </w:rPr>
+        <w:t xml:space="preserve"> de </w:t>
       </w:r>
       <w:proofErr w:type="spellStart"/>
       <w:r>
         <w:rPr>
           <w:rFonts w:cstheme="minorHAnsi"/>
+          <w:u w:val="single"/>
         </w:rPr>
         <w:t>catre</w:t>
       </w:r>
@@ -98,14 +115,34 @@
       <w:r>
         <w:rPr>
           <w:rFonts w:cstheme="minorHAnsi"/>
-        </w:rPr>
-        <w:t xml:space="preserve"> un om)</w:t>
-      </w:r>
-      <w:r>
-        <w:rPr>
-          <w:rFonts w:cstheme="minorHAnsi"/>
-        </w:rPr>
-        <w:t>, precum și o interfață grafică intuitivă pentru utilizator.</w:t>
+          <w:u w:val="single"/>
+        </w:rPr>
+        <w:t xml:space="preserve"> un om</w:t>
+      </w:r>
+      <w:r>
+        <w:rPr>
+          <w:rFonts w:cstheme="minorHAnsi"/>
+          <w:u w:val="single"/>
+        </w:rPr>
+        <w:t>)</w:t>
+      </w:r>
+      <w:r>
+        <w:rPr>
+          <w:rFonts w:cstheme="minorHAnsi"/>
+        </w:rPr>
+        <w:t xml:space="preserve"> </w:t>
+      </w:r>
+      <w:r>
+        <w:rPr>
+          <w:rFonts w:cstheme="minorHAnsi"/>
+        </w:rPr>
+        <w:t xml:space="preserve">, </w:t>
+      </w:r>
+      <w:r>
+        <w:rPr>
+          <w:rFonts w:cstheme="minorHAnsi"/>
+        </w:rPr>
+        <w:t>precum și o interfață grafică intuitivă pentru utilizator.</w:t>
       </w:r>
     </w:p>
     <w:p>
@@ -393,11 +430,13 @@
         <w:jc w:val="both"/>
         <w:rPr>
           <w:rFonts w:cstheme="minorHAnsi"/>
-        </w:rPr>
-      </w:pPr>
-      <w:r>
-        <w:rPr>
-          <w:rFonts w:cstheme="minorHAnsi"/>
+          <w:u w:val="single"/>
+        </w:rPr>
+      </w:pPr>
+      <w:r>
+        <w:rPr>
+          <w:rFonts w:cstheme="minorHAnsi"/>
+          <w:u w:val="single"/>
         </w:rPr>
         <w:t xml:space="preserve">Produsul are un nume si un </w:t>
       </w:r>
@@ -405,6 +444,7 @@
       <w:r>
         <w:rPr>
           <w:rFonts w:cstheme="minorHAnsi"/>
+          <w:u w:val="single"/>
         </w:rPr>
         <w:t>pret</w:t>
       </w:r>
@@ -412,6 +452,7 @@
       <w:r>
         <w:rPr>
           <w:rFonts w:cstheme="minorHAnsi"/>
+          <w:u w:val="single"/>
         </w:rPr>
         <w:t xml:space="preserve"> setat la </w:t>
       </w:r>
@@ -419,6 +460,7 @@
       <w:r>
         <w:rPr>
           <w:rFonts w:cstheme="minorHAnsi"/>
+          <w:u w:val="single"/>
         </w:rPr>
         <w:t>adaugarea</w:t>
       </w:r>
@@ -426,6 +468,7 @@
       <w:r>
         <w:rPr>
           <w:rFonts w:cstheme="minorHAnsi"/>
+          <w:u w:val="single"/>
         </w:rPr>
         <w:t xml:space="preserve"> lui</w:t>
       </w:r>
@@ -457,12 +500,20 @@
         <w:rPr>
           <w:rFonts w:cstheme="minorHAnsi"/>
         </w:rPr>
-        <w:t xml:space="preserve">. Tipul si categoria vor fi reprezentate </w:t>
+        <w:t xml:space="preserve">. </w:t>
+      </w:r>
+      <w:r>
+        <w:rPr>
+          <w:rFonts w:cstheme="minorHAnsi"/>
+          <w:u w:val="single"/>
+        </w:rPr>
+        <w:t xml:space="preserve">Tipul si categoria vor fi reprezentate </w:t>
       </w:r>
       <w:proofErr w:type="spellStart"/>
       <w:r>
         <w:rPr>
           <w:rFonts w:cstheme="minorHAnsi"/>
+          <w:u w:val="single"/>
         </w:rPr>
         <w:t>intr</w:t>
       </w:r>
@@ -470,6 +521,7 @@
       <w:r>
         <w:rPr>
           <w:rFonts w:cstheme="minorHAnsi"/>
+          <w:u w:val="single"/>
         </w:rPr>
         <w:t xml:space="preserve">-un </w:t>
       </w:r>
@@ -477,6 +529,7 @@
       <w:r>
         <w:rPr>
           <w:rFonts w:cstheme="minorHAnsi"/>
+          <w:u w:val="single"/>
         </w:rPr>
         <w:t>Enum</w:t>
       </w:r>
@@ -484,6 +537,7 @@
       <w:r>
         <w:rPr>
           <w:rFonts w:cstheme="minorHAnsi"/>
+          <w:u w:val="single"/>
         </w:rPr>
         <w:t>.</w:t>
       </w:r>
@@ -797,7 +851,26 @@
         <w:rPr>
           <w:rFonts w:cstheme="minorHAnsi"/>
         </w:rPr>
-        <w:t xml:space="preserve">La finalul fiecărei zile se salvează informațiile despre comenzile </w:t>
+        <w:t>La finalul fiecărei zile se salvează</w:t>
+      </w:r>
+      <w:r>
+        <w:rPr>
+          <w:rFonts w:cstheme="minorHAnsi"/>
+        </w:rPr>
+        <w:t xml:space="preserve"> </w:t>
+      </w:r>
+      <w:r>
+        <w:rPr>
+          <w:rFonts w:cstheme="minorHAnsi"/>
+          <w:u w:val="single"/>
+        </w:rPr>
+        <w:t>manual</w:t>
+      </w:r>
+      <w:r>
+        <w:rPr>
+          <w:rFonts w:cstheme="minorHAnsi"/>
+        </w:rPr>
+        <w:t xml:space="preserve"> informațiile despre comenzile </w:t>
       </w:r>
       <w:r>
         <w:rPr>
@@ -1092,6 +1165,7 @@
         <w:jc w:val="both"/>
         <w:rPr>
           <w:rFonts w:cstheme="minorHAnsi"/>
+          <w:u w:val="single"/>
           <w:lang w:val="pt-BR"/>
         </w:rPr>
       </w:pPr>
@@ -1099,6 +1173,7 @@
       <w:r>
         <w:rPr>
           <w:rFonts w:cstheme="minorHAnsi"/>
+          <w:u w:val="single"/>
         </w:rPr>
         <w:t>Aplicatia</w:t>
       </w:r>
@@ -1106,6 +1181,7 @@
       <w:r>
         <w:rPr>
           <w:rFonts w:cstheme="minorHAnsi"/>
+          <w:u w:val="single"/>
         </w:rPr>
         <w:t xml:space="preserve"> trebuie sa suporte un singur magazin cu un singur utilizator simultan.</w:t>
       </w:r>

</xml_diff>